<commit_message>
Deploy prebuilt public site with editable masters and verified push
</commit_message>
<xml_diff>
--- a/public/saul/cv.docx
+++ b/public/saul/cv.docx
@@ -31,7 +31,7 @@
           <w:i w:val="0"/>
           <w:sz w:val="26"/>
         </w:rPr>
-        <w:t>Educator | Community Organizer</w:t>
+        <w:t>Educator | Program Coordinator | Community Organizer</w:t>
       </w:r>
     </w:p>
     <w:p>
@@ -1834,7 +1834,6 @@
           <w:b/>
           <w:i w:val="0"/>
           <w:sz w:val="22"/>
-          <w:w w:val="94"/>
         </w:rPr>
         <w:t>Master’s Thesis</w:t>
       </w:r>
@@ -1844,7 +1843,6 @@
           <w:b w:val="0"/>
           <w:i w:val="0"/>
           <w:sz w:val="22"/>
-          <w:w w:val="94"/>
         </w:rPr>
         <w:t xml:space="preserve"> | </w:t>
       </w:r>
@@ -1854,7 +1852,6 @@
           <w:b w:val="0"/>
           <w:i w:val="0"/>
           <w:sz w:val="20"/>
-          <w:w w:val="94"/>
         </w:rPr>
         <w:t>Ritual Studies</w:t>
       </w:r>
@@ -1864,7 +1861,6 @@
           <w:b w:val="0"/>
           <w:i w:val="0"/>
           <w:sz w:val="22"/>
-          <w:w w:val="94"/>
         </w:rPr>
         <w:t xml:space="preserve"> | </w:t>
       </w:r>
@@ -1874,9 +1870,8 @@
           <w:b w:val="0"/>
           <w:i/>
           <w:sz w:val="22"/>
-          <w:w w:val="94"/>
-        </w:rPr>
-        <w:t>European Graduate School, Professor Catherine Malabou</w:t>
+        </w:rPr>
+        <w:t>European Graduate School</w:t>
       </w:r>
       <w:r>
         <w:rPr>
@@ -2082,7 +2077,6 @@
           <w:b/>
           <w:i w:val="0"/>
           <w:sz w:val="22"/>
-          <w:w w:val="84"/>
         </w:rPr>
         <w:t>Community Development Manager</w:t>
       </w:r>
@@ -2092,7 +2086,6 @@
           <w:b w:val="0"/>
           <w:i w:val="0"/>
           <w:sz w:val="22"/>
-          <w:w w:val="84"/>
         </w:rPr>
         <w:t xml:space="preserve"> | </w:t>
       </w:r>
@@ -2102,17 +2095,15 @@
           <w:b w:val="0"/>
           <w:i w:val="0"/>
           <w:sz w:val="20"/>
-          <w:w w:val="84"/>
-        </w:rPr>
-        <w:t>Budgeting, Volunteers &amp; Public Programs</w:t>
-      </w:r>
-      <w:r>
-        <w:rPr>
-          <w:rFonts w:ascii="Calibri" w:hAnsi="Calibri" w:eastAsia="Calibri" w:cs="Calibri"/>
-          <w:b w:val="0"/>
-          <w:i w:val="0"/>
-          <w:sz w:val="22"/>
-          <w:w w:val="84"/>
+        </w:rPr>
+        <w:t>~20 Volunteers</w:t>
+      </w:r>
+      <w:r>
+        <w:rPr>
+          <w:rFonts w:ascii="Calibri" w:hAnsi="Calibri" w:eastAsia="Calibri" w:cs="Calibri"/>
+          <w:b w:val="0"/>
+          <w:i w:val="0"/>
+          <w:sz w:val="22"/>
         </w:rPr>
         <w:t xml:space="preserve"> | </w:t>
       </w:r>
@@ -2122,7 +2113,6 @@
           <w:b w:val="0"/>
           <w:i/>
           <w:sz w:val="22"/>
-          <w:w w:val="84"/>
         </w:rPr>
         <w:t>Campus Crops, McGill</w:t>
       </w:r>
@@ -2132,7 +2122,6 @@
           <w:b w:val="0"/>
           <w:i w:val="0"/>
           <w:sz w:val="22"/>
-          <w:w w:val="84"/>
         </w:rPr>
         <w:t xml:space="preserve"> (Montreal)</w:t>
       </w:r>
@@ -2332,7 +2321,6 @@
           <w:b/>
           <w:i w:val="0"/>
           <w:sz w:val="22"/>
-          <w:w w:val="94"/>
         </w:rPr>
         <w:t>Conference Organizer</w:t>
       </w:r>
@@ -2342,7 +2330,6 @@
           <w:b w:val="0"/>
           <w:i w:val="0"/>
           <w:sz w:val="22"/>
-          <w:w w:val="94"/>
         </w:rPr>
         <w:t xml:space="preserve"> | </w:t>
       </w:r>
@@ -2352,17 +2339,15 @@
           <w:b w:val="0"/>
           <w:i w:val="0"/>
           <w:sz w:val="20"/>
-          <w:w w:val="94"/>
-        </w:rPr>
-        <w:t>University &amp; Secondary Model UN</w:t>
-      </w:r>
-      <w:r>
-        <w:rPr>
-          <w:rFonts w:ascii="Calibri" w:hAnsi="Calibri" w:eastAsia="Calibri" w:cs="Calibri"/>
-          <w:b w:val="0"/>
-          <w:i w:val="0"/>
-          <w:sz w:val="22"/>
-          <w:w w:val="94"/>
+        </w:rPr>
+        <w:t>McMUN &amp; SSUNS, ~1,600 Delegates</w:t>
+      </w:r>
+      <w:r>
+        <w:rPr>
+          <w:rFonts w:ascii="Calibri" w:hAnsi="Calibri" w:eastAsia="Calibri" w:cs="Calibri"/>
+          <w:b w:val="0"/>
+          <w:i w:val="0"/>
+          <w:sz w:val="22"/>
         </w:rPr>
         <w:t xml:space="preserve"> | </w:t>
       </w:r>
@@ -2372,7 +2357,6 @@
           <w:b w:val="0"/>
           <w:i/>
           <w:sz w:val="22"/>
-          <w:w w:val="94"/>
         </w:rPr>
         <w:t>McMUN &amp; SSUNS, IRSAM, McGill</w:t>
       </w:r>
@@ -2382,7 +2366,6 @@
           <w:b w:val="0"/>
           <w:i w:val="0"/>
           <w:sz w:val="22"/>
-          <w:w w:val="94"/>
         </w:rPr>
         <w:t xml:space="preserve"> (Montreal)</w:t>
       </w:r>
@@ -3611,7 +3594,7 @@
           <w:rFonts w:ascii="Cambria" w:hAnsi="Cambria" w:eastAsia="Cambria" w:cs="Cambria"/>
           <w:sz w:val="14"/>
         </w:rPr>
-        <w:t>IB Theory of Knowledge 2023 | TESOL, Indiana University 2016 | AODA Accessibility Standards 2026 | Berkley Invigilation Standards 2019 | Food Handler 2006 | Smart Serve (Historical) | Ontario Security Guard Licence (Historical) | Bronze Cross &amp; First Aid</w:t>
+        <w:t>IB Theory of Knowledge 2023 | TESOL, Indiana University 2016 | AODA Accessibility Standards 2026 | Berkley Invigilation Standards 2019 | Food Handler 2006 | Smart Serve (Historical) | Ontario Security Guard Licence (Historical) | Bronze Cross &amp; First Aid Training, 2006 (Not Current)</w:t>
       </w:r>
     </w:p>
     <w:p>

</xml_diff>